<commit_message>
continue upgrading pipe puzzle.
</commit_message>
<xml_diff>
--- a/ĐCTN_6051071059_LeThanhMinhKhoa.docx
+++ b/ĐCTN_6051071059_LeThanhMinhKhoa.docx
@@ -37,6 +37,12 @@
             <w:insideH w:val="none" w:color="auto" w:sz="0" w:space="0"/>
             <w:insideV w:val="none" w:color="auto" w:sz="0" w:space="0"/>
           </w:tblBorders>
+          <w:tblCellMar>
+            <w:top w:w="0" w:type="dxa"/>
+            <w:left w:w="108" w:type="dxa"/>
+            <w:bottom w:w="0" w:type="dxa"/>
+            <w:right w:w="108" w:type="dxa"/>
+          </w:tblCellMar>
         </w:tblPrEx>
         <w:tc>
           <w:tcPr>
@@ -5822,6 +5828,15 @@
                 <w:lang w:val="en-US"/>
               </w:rPr>
             </w:pPr>
+            <w:r>
+              <w:rPr>
+                <w:rFonts w:hint="default"/>
+                <w:sz w:val="24"/>
+                <w:szCs w:val="24"/>
+                <w:lang w:val="en-US"/>
+              </w:rPr>
+              <w:t>Chưa hoàn thành nâng cấp puzzle</w:t>
+            </w:r>
           </w:p>
         </w:tc>
         <w:tc>
@@ -5976,6 +5991,8 @@
                 <w:lang w:val="en-US"/>
               </w:rPr>
             </w:pPr>
+            <w:bookmarkStart w:id="0" w:name="_GoBack"/>
+            <w:bookmarkEnd w:id="0"/>
           </w:p>
         </w:tc>
         <w:tc>
@@ -6284,8 +6301,6 @@
                 <w:lang w:val="en-US"/>
               </w:rPr>
             </w:pPr>
-            <w:bookmarkStart w:id="0" w:name="_GoBack"/>
-            <w:bookmarkEnd w:id="0"/>
           </w:p>
         </w:tc>
         <w:tc>
@@ -6893,7 +6908,7 @@
     <w:lsdException w:uiPriority="99" w:name="Document Map"/>
     <w:lsdException w:uiPriority="99" w:name="Plain Text"/>
     <w:lsdException w:uiPriority="99" w:name="E-mail Signature"/>
-    <w:lsdException w:uiPriority="99" w:name="Normal (Web)"/>
+    <w:lsdException w:qFormat="1" w:uiPriority="99" w:name="Normal (Web)"/>
     <w:lsdException w:uiPriority="99" w:name="HTML Acronym"/>
     <w:lsdException w:uiPriority="99" w:name="HTML Address"/>
     <w:lsdException w:uiPriority="99" w:name="HTML Cite"/>
@@ -7216,6 +7231,7 @@
     <w:name w:val="Normal (Web)"/>
     <w:semiHidden/>
     <w:unhideWhenUsed/>
+    <w:qFormat/>
     <w:uiPriority w:val="99"/>
     <w:pPr>
       <w:spacing w:before="0" w:beforeAutospacing="1" w:after="0" w:afterAutospacing="1"/>
@@ -7223,6 +7239,7 @@
       <w:jc w:val="left"/>
     </w:pPr>
     <w:rPr>
+      <w:rFonts w:ascii="Times New Roman" w:hAnsi="Times New Roman" w:eastAsia="SimSun" w:cs="Times New Roman"/>
       <w:kern w:val="0"/>
       <w:sz w:val="24"/>
       <w:szCs w:val="24"/>

</xml_diff>